<commit_message>
fix(Web/PR3): fix broken Cyrillic chars, add screenshots and report images
Fix 7 corrupted Unicode characters in index.html, add seed test data,
embed 3 Playwright screenshots (hero, full page, mobile) into report.
</commit_message>
<xml_diff>
--- a/Year-2/Semester-2/Web/PR/PR3/Звіт_ПР3.docx
+++ b/Year-2/Semester-2/Web/PR/PR3/Звіт_ПР3.docx
@@ -3394,12 +3394,38 @@
         <w:jc w:val="both"/>
       </w:pPr>
       <w:r>
-        <w:rPr>
-          <w:rFonts w:ascii="Times New Roman" w:hAnsi="Times New Roman"/>
-          <w:b/>
-          <w:sz w:val="24"/>
-        </w:rPr>
-        <w:t>[Тут вставити скріншот: Hero-секція та статистика (desktop)]</w:t>
+        <w:drawing>
+          <wp:inline xmlns:a="http://schemas.openxmlformats.org/drawingml/2006/main" xmlns:pic="http://schemas.openxmlformats.org/drawingml/2006/picture">
+            <wp:extent cx="5760000" cy="3240000"/>
+            <wp:docPr id="1" name="Picture 1"/>
+            <wp:cNvGraphicFramePr>
+              <a:graphicFrameLocks noChangeAspect="1"/>
+            </wp:cNvGraphicFramePr>
+            <a:graphic>
+              <a:graphicData uri="http://schemas.openxmlformats.org/drawingml/2006/picture">
+                <pic:pic>
+                  <pic:nvPicPr>
+                    <pic:cNvPr id="0" name="hero_stats.png"/>
+                    <pic:cNvPicPr/>
+                  </pic:nvPicPr>
+                  <pic:blipFill>
+                    <a:blip r:embed="rId9"/>
+                    <a:stretch>
+                      <a:fillRect/>
+                    </a:stretch>
+                  </pic:blipFill>
+                  <pic:spPr>
+                    <a:xfrm>
+                      <a:off x="0" y="0"/>
+                      <a:ext cx="5760000" cy="3240000"/>
+                    </a:xfrm>
+                    <a:prstGeom prst="rect"/>
+                  </pic:spPr>
+                </pic:pic>
+              </a:graphicData>
+            </a:graphic>
+          </wp:inline>
+        </w:drawing>
       </w:r>
     </w:p>
     <w:p>
@@ -3433,12 +3459,38 @@
         <w:jc w:val="both"/>
       </w:pPr>
       <w:r>
-        <w:rPr>
-          <w:rFonts w:ascii="Times New Roman" w:hAnsi="Times New Roman"/>
-          <w:b/>
-          <w:sz w:val="24"/>
-        </w:rPr>
-        <w:t>[Тут вставити скріншот: Форма реєстрації та список ДГУ]</w:t>
+        <w:drawing>
+          <wp:inline xmlns:a="http://schemas.openxmlformats.org/drawingml/2006/main" xmlns:pic="http://schemas.openxmlformats.org/drawingml/2006/picture">
+            <wp:extent cx="5760000" cy="6585000"/>
+            <wp:docPr id="2" name="Picture 2"/>
+            <wp:cNvGraphicFramePr>
+              <a:graphicFrameLocks noChangeAspect="1"/>
+            </wp:cNvGraphicFramePr>
+            <a:graphic>
+              <a:graphicData uri="http://schemas.openxmlformats.org/drawingml/2006/picture">
+                <pic:pic>
+                  <pic:nvPicPr>
+                    <pic:cNvPr id="0" name="full_page.png"/>
+                    <pic:cNvPicPr/>
+                  </pic:nvPicPr>
+                  <pic:blipFill>
+                    <a:blip r:embed="rId10"/>
+                    <a:stretch>
+                      <a:fillRect/>
+                    </a:stretch>
+                  </pic:blipFill>
+                  <pic:spPr>
+                    <a:xfrm>
+                      <a:off x="0" y="0"/>
+                      <a:ext cx="5760000" cy="6585000"/>
+                    </a:xfrm>
+                    <a:prstGeom prst="rect"/>
+                  </pic:spPr>
+                </pic:pic>
+              </a:graphicData>
+            </a:graphic>
+          </wp:inline>
+        </w:drawing>
       </w:r>
     </w:p>
     <w:p>
@@ -3564,12 +3616,38 @@
         <w:jc w:val="both"/>
       </w:pPr>
       <w:r>
-        <w:rPr>
-          <w:rFonts w:ascii="Times New Roman" w:hAnsi="Times New Roman"/>
-          <w:b/>
-          <w:sz w:val="24"/>
-        </w:rPr>
-        <w:t>[Тут вставити скріншот: Фільтрація та пошук]</w:t>
+        <w:drawing>
+          <wp:inline xmlns:a="http://schemas.openxmlformats.org/drawingml/2006/main" xmlns:pic="http://schemas.openxmlformats.org/drawingml/2006/picture">
+            <wp:extent cx="5760000" cy="6585000"/>
+            <wp:docPr id="3" name="Picture 3"/>
+            <wp:cNvGraphicFramePr>
+              <a:graphicFrameLocks noChangeAspect="1"/>
+            </wp:cNvGraphicFramePr>
+            <a:graphic>
+              <a:graphicData uri="http://schemas.openxmlformats.org/drawingml/2006/picture">
+                <pic:pic>
+                  <pic:nvPicPr>
+                    <pic:cNvPr id="0" name="full_page.png"/>
+                    <pic:cNvPicPr/>
+                  </pic:nvPicPr>
+                  <pic:blipFill>
+                    <a:blip r:embed="rId10"/>
+                    <a:stretch>
+                      <a:fillRect/>
+                    </a:stretch>
+                  </pic:blipFill>
+                  <pic:spPr>
+                    <a:xfrm>
+                      <a:off x="0" y="0"/>
+                      <a:ext cx="5760000" cy="6585000"/>
+                    </a:xfrm>
+                    <a:prstGeom prst="rect"/>
+                  </pic:spPr>
+                </pic:pic>
+              </a:graphicData>
+            </a:graphic>
+          </wp:inline>
+        </w:drawing>
       </w:r>
     </w:p>
     <w:p>
@@ -3603,12 +3681,38 @@
         <w:jc w:val="both"/>
       </w:pPr>
       <w:r>
-        <w:rPr>
-          <w:rFonts w:ascii="Times New Roman" w:hAnsi="Times New Roman"/>
-          <w:b/>
-          <w:sz w:val="24"/>
-        </w:rPr>
-        <w:t>[Тут вставити скріншот: Мобільна версія]</w:t>
+        <w:drawing>
+          <wp:inline xmlns:a="http://schemas.openxmlformats.org/drawingml/2006/main" xmlns:pic="http://schemas.openxmlformats.org/drawingml/2006/picture">
+            <wp:extent cx="2880000" cy="29045760"/>
+            <wp:docPr id="4" name="Picture 4"/>
+            <wp:cNvGraphicFramePr>
+              <a:graphicFrameLocks noChangeAspect="1"/>
+            </wp:cNvGraphicFramePr>
+            <a:graphic>
+              <a:graphicData uri="http://schemas.openxmlformats.org/drawingml/2006/picture">
+                <pic:pic>
+                  <pic:nvPicPr>
+                    <pic:cNvPr id="0" name="mobile.png"/>
+                    <pic:cNvPicPr/>
+                  </pic:nvPicPr>
+                  <pic:blipFill>
+                    <a:blip r:embed="rId11"/>
+                    <a:stretch>
+                      <a:fillRect/>
+                    </a:stretch>
+                  </pic:blipFill>
+                  <pic:spPr>
+                    <a:xfrm>
+                      <a:off x="0" y="0"/>
+                      <a:ext cx="2880000" cy="29045760"/>
+                    </a:xfrm>
+                    <a:prstGeom prst="rect"/>
+                  </pic:spPr>
+                </pic:pic>
+              </a:graphicData>
+            </a:graphic>
+          </wp:inline>
+        </w:drawing>
       </w:r>
     </w:p>
     <w:p>

</xml_diff>